<commit_message>
court(dc): gate amicus, answering, motion, rehearing and reply briefs on the shared model; regenerated engines pass XENG on latex and docx (fb-595.54.53)
Co-Authored-By: Claude Opus 5.5 <noreply@anthropic.com>
</commit_message>
<xml_diff>
--- a/courts/dc-circuit/district-of-columbia/state/court-of-appeals/amicus-brief/usage/OUTPUT-amicus-brief.docx
+++ b/courts/dc-circuit/district-of-columbia/state/court-of-appeals/amicus-brief/usage/OUTPUT-amicus-brief.docx
@@ -4781,7 +4781,7 @@
         <w:tab/>
       </w:r>
       <w:r>
-        <w:t xml:space="preserve">26</w:t>
+        <w:t xml:space="preserve">27</w:t>
       </w:r>
     </w:p>
     <w:p>
@@ -7287,13 +7287,7 @@
         <w:pStyle w:val="BodyText"/>
       </w:pPr>
       <w:r>
-        <w:t xml:space="preserve">D.C. Code § 8</w:t>
-      </w:r>
-      <w:r>
-        <w:noBreakHyphen/>
-      </w:r>
-      <w:r>
-        <w:t xml:space="preserve">109.04.</w:t>
+        <w:t xml:space="preserve">D.C. Code § 8-⁠109.04.</w:t>
       </w:r>
       <w:r>
         <w:t xml:space="preserve"> </w:t>
@@ -7617,13 +7611,7 @@
         <w:pStyle w:val="BodyText"/>
       </w:pPr>
       <w:r>
-        <w:t xml:space="preserve">D.C. Code § 8</w:t>
-      </w:r>
-      <w:r>
-        <w:noBreakHyphen/>
-      </w:r>
-      <w:r>
-        <w:t xml:space="preserve">109.01.</w:t>
+        <w:t xml:space="preserve">D.C. Code § 8-⁠109.01.</w:t>
       </w:r>
       <w:r>
         <w:t xml:space="preserve"> </w:t>
@@ -7863,13 +7851,7 @@
         <w:pStyle w:val="BodyText"/>
       </w:pPr>
       <w:r>
-        <w:t xml:space="preserve">The DCEPA and its implementing regulations specify that the EIS process must begin at the earliest stages of government planning for major actions that the government intends to propose. Within thirty (30) days of receipt of an application for a proposed major action, the Mayor, board, agency, commission or authority of the District must determine whether an EIS is required, if the action involves the grant or issuance of a lease, permit, license, certificate or other entitlement by a District agency. D.C. Code § 8</w:t>
-      </w:r>
-      <w:r>
-        <w:noBreakHyphen/>
-      </w:r>
-      <w:r>
-        <w:t xml:space="preserve">109.03(c)⁠(1);</w:t>
+        <w:t xml:space="preserve">The DCEPA and its implementing regulations specify that the EIS process must begin at the earliest stages of government planning for major actions that the government intends to propose. Within thirty (30) days of receipt of an application for a proposed major action, the Mayor, board, agency, commission or authority of the District must determine whether an EIS is required, if the action involves the grant or issuance of a lease, permit, license, certificate or other entitlement by a District agency. D.C. Code § 8-⁠109.03(c)⁠(1);</w:t>
       </w:r>
       <w:r>
         <w:t xml:space="preserve"> </w:t>
@@ -7881,19 +7863,7 @@
         <w:t xml:space="preserve"> </w:t>
       </w:r>
       <w:r>
-        <w:t xml:space="preserve">Whenever the Mayor or a board, commission, authority, or person proposes or approves a major action that is likely to have substantial negative impact on the environment, if implemented, the Mayor, board, commission, authority, or person shall prepare or cause to be prepared, and transmit, in accordance with [D.C. Code § 8</w:t>
-      </w:r>
-      <w:r>
-        <w:noBreakHyphen/>
-      </w:r>
-      <w:r>
-        <w:t xml:space="preserve">109.03(b)], a detailed EIS at least 60 days prior to implementation of the proposed major action, unless the Mayor determines that the proposed major action has been or is subject to the functional equivalent of an EIS. D.C. Code § 8</w:t>
-      </w:r>
-      <w:r>
-        <w:noBreakHyphen/>
-      </w:r>
-      <w:r>
-        <w:t xml:space="preserve">109.03(a).</w:t>
+        <w:t xml:space="preserve">Whenever the Mayor or a board, commission, authority, or person proposes or approves a major action that is likely to have substantial negative impact on the environment, if implemented, the Mayor, board, commission, authority, or person shall prepare or cause to be prepared, and transmit, in accordance with [D.C. Code § 8-⁠109.03(b)], a detailed EIS at least 60 days prior to implementation of the proposed major action, unless the Mayor determines that the proposed major action has been or is subject to the functional equivalent of an EIS. D.C. Code § 8-⁠109.03(a).</w:t>
       </w:r>
       <w:r>
         <w:t xml:space="preserve"> </w:t>
@@ -7961,13 +7931,7 @@
         <w:t xml:space="preserve"> </w:t>
       </w:r>
       <w:r>
-        <w:t xml:space="preserve">73 (D.C. 2002) and D.C. Code § 8</w:t>
-      </w:r>
-      <w:r>
-        <w:noBreakHyphen/>
-      </w:r>
-      <w:r>
-        <w:t xml:space="preserve">109.01</w:t>
+        <w:t xml:space="preserve">73 (D.C. 2002) and D.C. Code § 8-⁠109.01</w:t>
       </w:r>
       <w:r>
         <w:t xml:space="preserve"> </w:t>
@@ -8228,13 +8192,7 @@
         <w:t xml:space="preserve"> </w:t>
       </w:r>
       <w:r>
-        <w:t xml:space="preserve">The Mayor, board, commission, or authority undertaking a major action must “substitute or require an applicant to substitute an alternative action or mitigating measures for a proposed action, if the alternative action or mitigating measures will accomplish the same purposes as the proposed action with minimized or no adverse environmental effects.” D.C. Code § 8</w:t>
-      </w:r>
-      <w:r>
-        <w:noBreakHyphen/>
-      </w:r>
-      <w:r>
-        <w:t xml:space="preserve">109.01.</w:t>
+        <w:t xml:space="preserve">The Mayor, board, commission, or authority undertaking a major action must “substitute or require an applicant to substitute an alternative action or mitigating measures for a proposed action, if the alternative action or mitigating measures will accomplish the same purposes as the proposed action with minimized or no adverse environmental effects.” D.C. Code § 8-⁠109.01.</w:t>
       </w:r>
     </w:p>
     <w:p>
@@ -10738,6 +10696,7 @@
     <w:unhideWhenUsed/>
     <w:qFormat/>
     <w:pPr>
+      <w:keepLines/>
       <w:spacing w:before="0" w:after="140" w:line="322" w:lineRule="exact"/>
     </w:pPr>
     <w:rPr>
@@ -10988,6 +10947,33 @@
     <w:pPr>
       <w:spacing w:before="0" w:after="0" w:line="322" w:lineRule="exact"/>
       <w:ind w:left="2160" w:hanging="720"/>
+    </w:pPr>
+  </w:style>
+  <w:style w:type="paragraph" w:customStyle="1" w:styleId="XdQuoteList1">
+    <w:name w:val="Xd Quote List 1"/>
+    <w:basedOn w:val="Normal"/>
+    <w:qFormat/>
+    <w:pPr>
+      <w:spacing w:before="0" w:after="0" w:line="322" w:lineRule="exact"/>
+      <w:ind w:left="1440" w:right="720" w:hanging="720"/>
+    </w:pPr>
+  </w:style>
+  <w:style w:type="paragraph" w:customStyle="1" w:styleId="XdQuoteList2">
+    <w:name w:val="Xd Quote List 2"/>
+    <w:basedOn w:val="Normal"/>
+    <w:qFormat/>
+    <w:pPr>
+      <w:spacing w:before="0" w:after="0" w:line="322" w:lineRule="exact"/>
+      <w:ind w:left="2160" w:right="720" w:hanging="720"/>
+    </w:pPr>
+  </w:style>
+  <w:style w:type="paragraph" w:customStyle="1" w:styleId="XdQuoteList3">
+    <w:name w:val="Xd Quote List 3"/>
+    <w:basedOn w:val="Normal"/>
+    <w:qFormat/>
+    <w:pPr>
+      <w:spacing w:before="0" w:after="0" w:line="322" w:lineRule="exact"/>
+      <w:ind w:left="2880" w:right="720" w:hanging="720"/>
     </w:pPr>
   </w:style>
   <w:style w:type="paragraph" w:customStyle="1" w:styleId="XdQuoteOnly">

</xml_diff>